<commit_message>
Cotización 2026 corregida con las observaciones de Dana
A nombre de Rubén, concepto exacto de la factura en la descripción, monto
general con IVA sin tabla por concepto y cronograma con los módulos del
cuadro. Salen del repo los locks de LibreOffice.

Co-Authored-By: Claude Fable 5.1 <noreply@anthropic.com>
</commit_message>
<xml_diff>
--- a/docs/records/assets/2026-10-02-cotizacion-servicio-actualizacion-onigies-2026.docx
+++ b/docs/records/assets/2026-10-02-cotizacion-servicio-actualizacion-onigies-2026.docx
@@ -21,7 +21,7 @@
           <w:sz w:val="28"/>
           <w:szCs w:val="28"/>
         </w:rPr>
-        <w:t xml:space="preserve">Servicio de actualización de plataforma ONIGIES</w:t>
+        <w:t xml:space="preserve">Servicio de actualización de plataforma ONIGIES.</w:t>
       </w:r>
     </w:p>
     <w:p>
@@ -53,11 +53,15 @@
         <w:spacing w:before="240"/>
       </w:pPr>
       <w:r>
-        <w:t xml:space="preserve">Dra. Norma Blazquez</w:t>
+        <w:t xml:space="preserve">Rubén Hernández</w:t>
       </w:r>
       <w:r>
         <w:br/>
-        <w:t xml:space="preserve">Titular de la Coordinación para la Igualdad de Género de la UNAM</w:t>
+        <w:t xml:space="preserve">Dirección de Políticas de Igualdad y No Discriminación</w:t>
+      </w:r>
+      <w:r>
+        <w:br/>
+        <w:t xml:space="preserve">Coordinación para la Igualdad de Género de la UNAM</w:t>
       </w:r>
       <w:r>
         <w:br/>
@@ -118,881 +122,20 @@
     </w:p>
     <w:p>
       <w:r>
-        <w:t xml:space="preserve">El Observatorio Nacional para la Igualdad de Género en las Instituciones de Educación Superior (ONIGIES) renueva su plataforma para registrar, validar y dar a conocer los resultados de las instituciones de educación superior (IES) conforme a la nueva metodología. El servicio comprende los siguientes módulos:</w:t>
+        <w:rPr>
+          <w:b/>
+          <w:bCs/>
+        </w:rPr>
+        <w:t xml:space="preserve">Concepto: </w:t>
+      </w:r>
+      <w:r>
+        <w:t xml:space="preserve">Servicio de actualización de plataforma ONIGIES.</w:t>
       </w:r>
     </w:p>
-    <w:tbl>
-      <w:tblPr>
-        <w:tblW w:type="dxa" w:w="9360"/>
-        <w:tblBorders>
-          <w:top w:val="single" w:color="auto" w:sz="4"/>
-          <w:left w:val="single" w:color="auto" w:sz="4"/>
-          <w:bottom w:val="single" w:color="auto" w:sz="4"/>
-          <w:right w:val="single" w:color="auto" w:sz="4"/>
-          <w:insideH w:val="single" w:color="auto" w:sz="4"/>
-          <w:insideV w:val="single" w:color="auto" w:sz="4"/>
-        </w:tblBorders>
-      </w:tblPr>
-      <w:tblGrid>
-        <w:gridCol w:w="6960"/>
-        <w:gridCol w:w="2400"/>
-      </w:tblGrid>
-      <w:tr>
-        <w:trPr>
-          <w:cantSplit/>
-        </w:trPr>
-        <w:tc>
-          <w:tcPr>
-            <w:tcW w:type="dxa" w:w="6960"/>
-            <w:tcBorders>
-              <w:top w:val="single" w:color="A6A6A6" w:sz="4"/>
-              <w:left w:val="single" w:color="A6A6A6" w:sz="4"/>
-              <w:bottom w:val="single" w:color="A6A6A6" w:sz="4"/>
-              <w:right w:val="single" w:color="A6A6A6" w:sz="4"/>
-            </w:tcBorders>
-            <w:shd w:fill="D9D9D9" w:color="auto" w:val="clear"/>
-            <w:tcMar>
-              <w:top w:type="dxa" w:w="30"/>
-              <w:left w:type="dxa" w:w="100"/>
-              <w:bottom w:type="dxa" w:w="30"/>
-              <w:right w:type="dxa" w:w="100"/>
-            </w:tcMar>
-            <w:vAlign w:val="center"/>
-          </w:tcPr>
-          <w:p>
-            <w:pPr>
-              <w:keepNext/>
-              <w:spacing w:after="0" w:before="0" w:line="240"/>
-            </w:pPr>
-            <w:r>
-              <w:rPr>
-                <w:b/>
-                <w:bCs/>
-              </w:rPr>
-              <w:t xml:space="preserve">Módulos</w:t>
-            </w:r>
-          </w:p>
-        </w:tc>
-        <w:tc>
-          <w:tcPr>
-            <w:tcW w:type="dxa" w:w="2400"/>
-            <w:tcBorders>
-              <w:top w:val="single" w:color="A6A6A6" w:sz="4"/>
-              <w:left w:val="single" w:color="A6A6A6" w:sz="4"/>
-              <w:bottom w:val="single" w:color="A6A6A6" w:sz="4"/>
-              <w:right w:val="single" w:color="A6A6A6" w:sz="4"/>
-            </w:tcBorders>
-            <w:shd w:fill="D9D9D9" w:color="auto" w:val="clear"/>
-            <w:tcMar>
-              <w:top w:type="dxa" w:w="30"/>
-              <w:left w:type="dxa" w:w="100"/>
-              <w:bottom w:type="dxa" w:w="30"/>
-              <w:right w:type="dxa" w:w="100"/>
-            </w:tcMar>
-            <w:vAlign w:val="center"/>
-          </w:tcPr>
-          <w:p>
-            <w:pPr>
-              <w:keepNext/>
-              <w:spacing w:after="0" w:before="0" w:line="240"/>
-              <w:jc w:val="right"/>
-            </w:pPr>
-            <w:r>
-              <w:rPr>
-                <w:b/>
-                <w:bCs/>
-              </w:rPr>
-              <w:t xml:space="preserve">Costo (MXN)</w:t>
-            </w:r>
-          </w:p>
-        </w:tc>
-      </w:tr>
-      <w:tr>
-        <w:tc>
-          <w:tcPr>
-            <w:tcW w:type="dxa" w:w="6960"/>
-            <w:tcBorders>
-              <w:top w:val="single" w:color="A6A6A6" w:sz="4"/>
-              <w:left w:val="single" w:color="A6A6A6" w:sz="4"/>
-              <w:bottom w:val="single" w:color="A6A6A6" w:sz="4"/>
-              <w:right w:val="single" w:color="A6A6A6" w:sz="4"/>
-            </w:tcBorders>
-            <w:tcMar>
-              <w:top w:type="dxa" w:w="30"/>
-              <w:left w:type="dxa" w:w="100"/>
-              <w:bottom w:type="dxa" w:w="30"/>
-              <w:right w:type="dxa" w:w="100"/>
-            </w:tcMar>
-            <w:vAlign w:val="center"/>
-          </w:tcPr>
-          <w:p>
-            <w:pPr>
-              <w:keepNext/>
-              <w:spacing w:after="0" w:before="0" w:line="240"/>
-            </w:pPr>
-            <w:r>
-              <w:rPr>
-                <w:b/>
-                <w:bCs/>
-              </w:rPr>
-              <w:t xml:space="preserve">Plataforma pública</w:t>
-            </w:r>
-          </w:p>
-        </w:tc>
-        <w:tc>
-          <w:tcPr>
-            <w:tcW w:type="dxa" w:w="2400"/>
-            <w:tcBorders>
-              <w:top w:val="single" w:color="A6A6A6" w:sz="4"/>
-              <w:left w:val="single" w:color="A6A6A6" w:sz="4"/>
-              <w:bottom w:val="single" w:color="A6A6A6" w:sz="4"/>
-              <w:right w:val="single" w:color="A6A6A6" w:sz="4"/>
-            </w:tcBorders>
-            <w:tcMar>
-              <w:top w:type="dxa" w:w="30"/>
-              <w:left w:type="dxa" w:w="100"/>
-              <w:bottom w:type="dxa" w:w="30"/>
-              <w:right w:type="dxa" w:w="100"/>
-            </w:tcMar>
-            <w:vAlign w:val="center"/>
-          </w:tcPr>
-          <w:p>
-            <w:pPr>
-              <w:keepNext/>
-              <w:spacing w:after="0" w:before="0" w:line="240"/>
-              <w:jc w:val="right"/>
-            </w:pPr>
-            <w:r>
-              <w:rPr>
-                <w:b/>
-                <w:bCs/>
-              </w:rPr>
-              <w:t xml:space="preserve">43,000</w:t>
-            </w:r>
-          </w:p>
-        </w:tc>
-      </w:tr>
-      <w:tr>
-        <w:tc>
-          <w:tcPr>
-            <w:tcW w:type="dxa" w:w="6960"/>
-            <w:tcBorders>
-              <w:top w:val="single" w:color="A6A6A6" w:sz="4"/>
-              <w:left w:val="single" w:color="A6A6A6" w:sz="4"/>
-              <w:bottom w:val="single" w:color="A6A6A6" w:sz="4"/>
-              <w:right w:val="single" w:color="A6A6A6" w:sz="4"/>
-            </w:tcBorders>
-            <w:tcMar>
-              <w:top w:type="dxa" w:w="30"/>
-              <w:left w:type="dxa" w:w="100"/>
-              <w:bottom w:type="dxa" w:w="30"/>
-              <w:right w:type="dxa" w:w="100"/>
-            </w:tcMar>
-            <w:vAlign w:val="center"/>
-          </w:tcPr>
-          <w:p>
-            <w:pPr>
-              <w:keepNext/>
-              <w:spacing w:after="0" w:before="0" w:line="240"/>
-            </w:pPr>
-            <w:r>
-              <w:t xml:space="preserve">Diseño de nueva identidad gráfica del sitio web</w:t>
-            </w:r>
-          </w:p>
-        </w:tc>
-        <w:tc>
-          <w:tcPr>
-            <w:tcW w:type="dxa" w:w="2400"/>
-            <w:tcBorders>
-              <w:top w:val="single" w:color="A6A6A6" w:sz="4"/>
-              <w:left w:val="single" w:color="A6A6A6" w:sz="4"/>
-              <w:bottom w:val="single" w:color="A6A6A6" w:sz="4"/>
-              <w:right w:val="single" w:color="A6A6A6" w:sz="4"/>
-            </w:tcBorders>
-            <w:tcMar>
-              <w:top w:type="dxa" w:w="30"/>
-              <w:left w:type="dxa" w:w="100"/>
-              <w:bottom w:type="dxa" w:w="30"/>
-              <w:right w:type="dxa" w:w="100"/>
-            </w:tcMar>
-            <w:vAlign w:val="center"/>
-          </w:tcPr>
-          <w:p>
-            <w:pPr>
-              <w:keepNext/>
-              <w:spacing w:after="0" w:before="0" w:line="240"/>
-              <w:jc w:val="right"/>
-            </w:pPr>
-            <w:r>
-              <w:t xml:space="preserve">16,000</w:t>
-            </w:r>
-          </w:p>
-        </w:tc>
-      </w:tr>
-      <w:tr>
-        <w:tc>
-          <w:tcPr>
-            <w:tcW w:type="dxa" w:w="6960"/>
-            <w:tcBorders>
-              <w:top w:val="single" w:color="A6A6A6" w:sz="4"/>
-              <w:left w:val="single" w:color="A6A6A6" w:sz="4"/>
-              <w:bottom w:val="single" w:color="A6A6A6" w:sz="4"/>
-              <w:right w:val="single" w:color="A6A6A6" w:sz="4"/>
-            </w:tcBorders>
-            <w:tcMar>
-              <w:top w:type="dxa" w:w="30"/>
-              <w:left w:type="dxa" w:w="100"/>
-              <w:bottom w:type="dxa" w:w="30"/>
-              <w:right w:type="dxa" w:w="100"/>
-            </w:tcMar>
-            <w:vAlign w:val="center"/>
-          </w:tcPr>
-          <w:p>
-            <w:pPr>
-              <w:keepNext/>
-              <w:spacing w:after="0" w:before="0" w:line="240"/>
-            </w:pPr>
-            <w:r>
-              <w:t xml:space="preserve">Configuración base de vistas web de sitio público</w:t>
-            </w:r>
-          </w:p>
-        </w:tc>
-        <w:tc>
-          <w:tcPr>
-            <w:tcW w:type="dxa" w:w="2400"/>
-            <w:tcBorders>
-              <w:top w:val="single" w:color="A6A6A6" w:sz="4"/>
-              <w:left w:val="single" w:color="A6A6A6" w:sz="4"/>
-              <w:bottom w:val="single" w:color="A6A6A6" w:sz="4"/>
-              <w:right w:val="single" w:color="A6A6A6" w:sz="4"/>
-            </w:tcBorders>
-            <w:tcMar>
-              <w:top w:type="dxa" w:w="30"/>
-              <w:left w:type="dxa" w:w="100"/>
-              <w:bottom w:type="dxa" w:w="30"/>
-              <w:right w:type="dxa" w:w="100"/>
-            </w:tcMar>
-            <w:vAlign w:val="center"/>
-          </w:tcPr>
-          <w:p>
-            <w:pPr>
-              <w:keepNext/>
-              <w:spacing w:after="0" w:before="0" w:line="240"/>
-              <w:jc w:val="right"/>
-            </w:pPr>
-            <w:r>
-              <w:t xml:space="preserve">17,000</w:t>
-            </w:r>
-          </w:p>
-        </w:tc>
-      </w:tr>
-      <w:tr>
-        <w:tc>
-          <w:tcPr>
-            <w:tcW w:type="dxa" w:w="6960"/>
-            <w:tcBorders>
-              <w:top w:val="single" w:color="A6A6A6" w:sz="4"/>
-              <w:left w:val="single" w:color="A6A6A6" w:sz="4"/>
-              <w:bottom w:val="single" w:color="A6A6A6" w:sz="4"/>
-              <w:right w:val="single" w:color="A6A6A6" w:sz="4"/>
-            </w:tcBorders>
-            <w:tcMar>
-              <w:top w:type="dxa" w:w="30"/>
-              <w:left w:type="dxa" w:w="100"/>
-              <w:bottom w:type="dxa" w:w="30"/>
-              <w:right w:type="dxa" w:w="100"/>
-            </w:tcMar>
-            <w:vAlign w:val="center"/>
-          </w:tcPr>
-          <w:p>
-            <w:pPr>
-              <w:keepNext/>
-              <w:spacing w:after="0" w:before="0" w:line="240"/>
-            </w:pPr>
-            <w:r>
-              <w:t xml:space="preserve">Interactividad web y fichas intermedias</w:t>
-            </w:r>
-          </w:p>
-        </w:tc>
-        <w:tc>
-          <w:tcPr>
-            <w:tcW w:type="dxa" w:w="2400"/>
-            <w:tcBorders>
-              <w:top w:val="single" w:color="A6A6A6" w:sz="4"/>
-              <w:left w:val="single" w:color="A6A6A6" w:sz="4"/>
-              <w:bottom w:val="single" w:color="A6A6A6" w:sz="4"/>
-              <w:right w:val="single" w:color="A6A6A6" w:sz="4"/>
-            </w:tcBorders>
-            <w:tcMar>
-              <w:top w:type="dxa" w:w="30"/>
-              <w:left w:type="dxa" w:w="100"/>
-              <w:bottom w:type="dxa" w:w="30"/>
-              <w:right w:type="dxa" w:w="100"/>
-            </w:tcMar>
-            <w:vAlign w:val="center"/>
-          </w:tcPr>
-          <w:p>
-            <w:pPr>
-              <w:keepNext/>
-              <w:spacing w:after="0" w:before="0" w:line="240"/>
-              <w:jc w:val="right"/>
-            </w:pPr>
-            <w:r>
-              <w:t xml:space="preserve">7,000</w:t>
-            </w:r>
-          </w:p>
-        </w:tc>
-      </w:tr>
-      <w:tr>
-        <w:tc>
-          <w:tcPr>
-            <w:tcW w:type="dxa" w:w="6960"/>
-            <w:tcBorders>
-              <w:top w:val="single" w:color="A6A6A6" w:sz="4"/>
-              <w:left w:val="single" w:color="A6A6A6" w:sz="4"/>
-              <w:bottom w:val="single" w:color="A6A6A6" w:sz="4"/>
-              <w:right w:val="single" w:color="A6A6A6" w:sz="4"/>
-            </w:tcBorders>
-            <w:tcMar>
-              <w:top w:type="dxa" w:w="30"/>
-              <w:left w:type="dxa" w:w="100"/>
-              <w:bottom w:type="dxa" w:w="30"/>
-              <w:right w:type="dxa" w:w="100"/>
-            </w:tcMar>
-            <w:vAlign w:val="center"/>
-          </w:tcPr>
-          <w:p>
-            <w:pPr>
-              <w:keepNext/>
-              <w:spacing w:after="0" w:before="0" w:line="240"/>
-            </w:pPr>
-            <w:r>
-              <w:t xml:space="preserve">Modificación de versión 1 para compatibilidad</w:t>
-            </w:r>
-          </w:p>
-        </w:tc>
-        <w:tc>
-          <w:tcPr>
-            <w:tcW w:type="dxa" w:w="2400"/>
-            <w:tcBorders>
-              <w:top w:val="single" w:color="A6A6A6" w:sz="4"/>
-              <w:left w:val="single" w:color="A6A6A6" w:sz="4"/>
-              <w:bottom w:val="single" w:color="A6A6A6" w:sz="4"/>
-              <w:right w:val="single" w:color="A6A6A6" w:sz="4"/>
-            </w:tcBorders>
-            <w:tcMar>
-              <w:top w:type="dxa" w:w="30"/>
-              <w:left w:type="dxa" w:w="100"/>
-              <w:bottom w:type="dxa" w:w="30"/>
-              <w:right w:type="dxa" w:w="100"/>
-            </w:tcMar>
-            <w:vAlign w:val="center"/>
-          </w:tcPr>
-          <w:p>
-            <w:pPr>
-              <w:keepNext/>
-              <w:spacing w:after="0" w:before="0" w:line="240"/>
-              <w:jc w:val="right"/>
-            </w:pPr>
-            <w:r>
-              <w:t xml:space="preserve">3,000</w:t>
-            </w:r>
-          </w:p>
-        </w:tc>
-      </w:tr>
-      <w:tr>
-        <w:tc>
-          <w:tcPr>
-            <w:tcW w:type="dxa" w:w="6960"/>
-            <w:tcBorders>
-              <w:top w:val="single" w:color="A6A6A6" w:sz="4"/>
-              <w:left w:val="single" w:color="A6A6A6" w:sz="4"/>
-              <w:bottom w:val="single" w:color="A6A6A6" w:sz="4"/>
-              <w:right w:val="single" w:color="A6A6A6" w:sz="4"/>
-            </w:tcBorders>
-            <w:tcMar>
-              <w:top w:type="dxa" w:w="30"/>
-              <w:left w:type="dxa" w:w="100"/>
-              <w:bottom w:type="dxa" w:w="30"/>
-              <w:right w:type="dxa" w:w="100"/>
-            </w:tcMar>
-            <w:vAlign w:val="center"/>
-          </w:tcPr>
-          <w:p>
-            <w:pPr>
-              <w:keepNext/>
-              <w:spacing w:after="0" w:before="0" w:line="240"/>
-            </w:pPr>
-            <w:r>
-              <w:rPr>
-                <w:b/>
-                <w:bCs/>
-              </w:rPr>
-              <w:t xml:space="preserve">Base de datos</w:t>
-            </w:r>
-          </w:p>
-        </w:tc>
-        <w:tc>
-          <w:tcPr>
-            <w:tcW w:type="dxa" w:w="2400"/>
-            <w:tcBorders>
-              <w:top w:val="single" w:color="A6A6A6" w:sz="4"/>
-              <w:left w:val="single" w:color="A6A6A6" w:sz="4"/>
-              <w:bottom w:val="single" w:color="A6A6A6" w:sz="4"/>
-              <w:right w:val="single" w:color="A6A6A6" w:sz="4"/>
-            </w:tcBorders>
-            <w:tcMar>
-              <w:top w:type="dxa" w:w="30"/>
-              <w:left w:type="dxa" w:w="100"/>
-              <w:bottom w:type="dxa" w:w="30"/>
-              <w:right w:type="dxa" w:w="100"/>
-            </w:tcMar>
-            <w:vAlign w:val="center"/>
-          </w:tcPr>
-          <w:p>
-            <w:pPr>
-              <w:keepNext/>
-              <w:spacing w:after="0" w:before="0" w:line="240"/>
-              <w:jc w:val="right"/>
-            </w:pPr>
-            <w:r>
-              <w:rPr>
-                <w:b/>
-                <w:bCs/>
-              </w:rPr>
-              <w:t xml:space="preserve">17,000</w:t>
-            </w:r>
-          </w:p>
-        </w:tc>
-      </w:tr>
-      <w:tr>
-        <w:tc>
-          <w:tcPr>
-            <w:tcW w:type="dxa" w:w="6960"/>
-            <w:tcBorders>
-              <w:top w:val="single" w:color="A6A6A6" w:sz="4"/>
-              <w:left w:val="single" w:color="A6A6A6" w:sz="4"/>
-              <w:bottom w:val="single" w:color="A6A6A6" w:sz="4"/>
-              <w:right w:val="single" w:color="A6A6A6" w:sz="4"/>
-            </w:tcBorders>
-            <w:tcMar>
-              <w:top w:type="dxa" w:w="30"/>
-              <w:left w:type="dxa" w:w="100"/>
-              <w:bottom w:type="dxa" w:w="30"/>
-              <w:right w:type="dxa" w:w="100"/>
-            </w:tcMar>
-            <w:vAlign w:val="center"/>
-          </w:tcPr>
-          <w:p>
-            <w:pPr>
-              <w:keepNext/>
-              <w:spacing w:after="0" w:before="0" w:line="240"/>
-            </w:pPr>
-            <w:r>
-              <w:t xml:space="preserve">Exportaciones a Excel</w:t>
-            </w:r>
-          </w:p>
-        </w:tc>
-        <w:tc>
-          <w:tcPr>
-            <w:tcW w:type="dxa" w:w="2400"/>
-            <w:tcBorders>
-              <w:top w:val="single" w:color="A6A6A6" w:sz="4"/>
-              <w:left w:val="single" w:color="A6A6A6" w:sz="4"/>
-              <w:bottom w:val="single" w:color="A6A6A6" w:sz="4"/>
-              <w:right w:val="single" w:color="A6A6A6" w:sz="4"/>
-            </w:tcBorders>
-            <w:tcMar>
-              <w:top w:type="dxa" w:w="30"/>
-              <w:left w:type="dxa" w:w="100"/>
-              <w:bottom w:type="dxa" w:w="30"/>
-              <w:right w:type="dxa" w:w="100"/>
-            </w:tcMar>
-            <w:vAlign w:val="center"/>
-          </w:tcPr>
-          <w:p>
-            <w:pPr>
-              <w:keepNext/>
-              <w:spacing w:after="0" w:before="0" w:line="240"/>
-              <w:jc w:val="right"/>
-            </w:pPr>
-            <w:r>
-              <w:t xml:space="preserve">12,000</w:t>
-            </w:r>
-          </w:p>
-        </w:tc>
-      </w:tr>
-      <w:tr>
-        <w:tc>
-          <w:tcPr>
-            <w:tcW w:type="dxa" w:w="6960"/>
-            <w:tcBorders>
-              <w:top w:val="single" w:color="A6A6A6" w:sz="4"/>
-              <w:left w:val="single" w:color="A6A6A6" w:sz="4"/>
-              <w:bottom w:val="single" w:color="A6A6A6" w:sz="4"/>
-              <w:right w:val="single" w:color="A6A6A6" w:sz="4"/>
-            </w:tcBorders>
-            <w:tcMar>
-              <w:top w:type="dxa" w:w="30"/>
-              <w:left w:type="dxa" w:w="100"/>
-              <w:bottom w:type="dxa" w:w="30"/>
-              <w:right w:type="dxa" w:w="100"/>
-            </w:tcMar>
-            <w:vAlign w:val="center"/>
-          </w:tcPr>
-          <w:p>
-            <w:pPr>
-              <w:keepNext/>
-              <w:spacing w:after="0" w:before="0" w:line="240"/>
-            </w:pPr>
-            <w:r>
-              <w:t xml:space="preserve">Cálculo de indicadores y ponderaciones</w:t>
-            </w:r>
-          </w:p>
-        </w:tc>
-        <w:tc>
-          <w:tcPr>
-            <w:tcW w:type="dxa" w:w="2400"/>
-            <w:tcBorders>
-              <w:top w:val="single" w:color="A6A6A6" w:sz="4"/>
-              <w:left w:val="single" w:color="A6A6A6" w:sz="4"/>
-              <w:bottom w:val="single" w:color="A6A6A6" w:sz="4"/>
-              <w:right w:val="single" w:color="A6A6A6" w:sz="4"/>
-            </w:tcBorders>
-            <w:tcMar>
-              <w:top w:type="dxa" w:w="30"/>
-              <w:left w:type="dxa" w:w="100"/>
-              <w:bottom w:type="dxa" w:w="30"/>
-              <w:right w:type="dxa" w:w="100"/>
-            </w:tcMar>
-            <w:vAlign w:val="center"/>
-          </w:tcPr>
-          <w:p>
-            <w:pPr>
-              <w:keepNext/>
-              <w:spacing w:after="0" w:before="0" w:line="240"/>
-              <w:jc w:val="right"/>
-            </w:pPr>
-            <w:r>
-              <w:t xml:space="preserve">5,000</w:t>
-            </w:r>
-          </w:p>
-        </w:tc>
-      </w:tr>
-      <w:tr>
-        <w:tc>
-          <w:tcPr>
-            <w:tcW w:type="dxa" w:w="6960"/>
-            <w:tcBorders>
-              <w:top w:val="single" w:color="A6A6A6" w:sz="4"/>
-              <w:left w:val="single" w:color="A6A6A6" w:sz="4"/>
-              <w:bottom w:val="single" w:color="A6A6A6" w:sz="4"/>
-              <w:right w:val="single" w:color="A6A6A6" w:sz="4"/>
-            </w:tcBorders>
-            <w:tcMar>
-              <w:top w:type="dxa" w:w="30"/>
-              <w:left w:type="dxa" w:w="100"/>
-              <w:bottom w:type="dxa" w:w="30"/>
-              <w:right w:type="dxa" w:w="100"/>
-            </w:tcMar>
-            <w:vAlign w:val="center"/>
-          </w:tcPr>
-          <w:p>
-            <w:pPr>
-              <w:keepNext/>
-              <w:spacing w:after="0" w:before="0" w:line="240"/>
-            </w:pPr>
-            <w:r>
-              <w:rPr>
-                <w:b/>
-                <w:bCs/>
-              </w:rPr>
-              <w:t xml:space="preserve">Diseño de visualizaciones de población</w:t>
-            </w:r>
-          </w:p>
-        </w:tc>
-        <w:tc>
-          <w:tcPr>
-            <w:tcW w:type="dxa" w:w="2400"/>
-            <w:tcBorders>
-              <w:top w:val="single" w:color="A6A6A6" w:sz="4"/>
-              <w:left w:val="single" w:color="A6A6A6" w:sz="4"/>
-              <w:bottom w:val="single" w:color="A6A6A6" w:sz="4"/>
-              <w:right w:val="single" w:color="A6A6A6" w:sz="4"/>
-            </w:tcBorders>
-            <w:tcMar>
-              <w:top w:type="dxa" w:w="30"/>
-              <w:left w:type="dxa" w:w="100"/>
-              <w:bottom w:type="dxa" w:w="30"/>
-              <w:right w:type="dxa" w:w="100"/>
-            </w:tcMar>
-            <w:vAlign w:val="center"/>
-          </w:tcPr>
-          <w:p>
-            <w:pPr>
-              <w:keepNext/>
-              <w:spacing w:after="0" w:before="0" w:line="240"/>
-              <w:jc w:val="right"/>
-            </w:pPr>
-            <w:r>
-              <w:rPr>
-                <w:b/>
-                <w:bCs/>
-              </w:rPr>
-              <w:t xml:space="preserve">20,000</w:t>
-            </w:r>
-          </w:p>
-        </w:tc>
-      </w:tr>
-      <w:tr>
-        <w:tc>
-          <w:tcPr>
-            <w:tcW w:type="dxa" w:w="6960"/>
-            <w:tcBorders>
-              <w:top w:val="single" w:color="A6A6A6" w:sz="4"/>
-              <w:left w:val="single" w:color="A6A6A6" w:sz="4"/>
-              <w:bottom w:val="single" w:color="A6A6A6" w:sz="4"/>
-              <w:right w:val="single" w:color="A6A6A6" w:sz="4"/>
-            </w:tcBorders>
-            <w:tcMar>
-              <w:top w:type="dxa" w:w="30"/>
-              <w:left w:type="dxa" w:w="100"/>
-              <w:bottom w:type="dxa" w:w="30"/>
-              <w:right w:type="dxa" w:w="100"/>
-            </w:tcMar>
-            <w:vAlign w:val="center"/>
-          </w:tcPr>
-          <w:p>
-            <w:pPr>
-              <w:keepNext/>
-              <w:spacing w:after="0" w:before="0" w:line="240"/>
-            </w:pPr>
-            <w:r>
-              <w:t xml:space="preserve">Diseño de visualizaciones de población</w:t>
-            </w:r>
-          </w:p>
-        </w:tc>
-        <w:tc>
-          <w:tcPr>
-            <w:tcW w:type="dxa" w:w="2400"/>
-            <w:tcBorders>
-              <w:top w:val="single" w:color="A6A6A6" w:sz="4"/>
-              <w:left w:val="single" w:color="A6A6A6" w:sz="4"/>
-              <w:bottom w:val="single" w:color="A6A6A6" w:sz="4"/>
-              <w:right w:val="single" w:color="A6A6A6" w:sz="4"/>
-            </w:tcBorders>
-            <w:tcMar>
-              <w:top w:type="dxa" w:w="30"/>
-              <w:left w:type="dxa" w:w="100"/>
-              <w:bottom w:type="dxa" w:w="30"/>
-              <w:right w:type="dxa" w:w="100"/>
-            </w:tcMar>
-            <w:vAlign w:val="center"/>
-          </w:tcPr>
-          <w:p>
-            <w:pPr>
-              <w:keepNext/>
-              <w:spacing w:after="0" w:before="0" w:line="240"/>
-              <w:jc w:val="right"/>
-            </w:pPr>
-            <w:r>
-              <w:t xml:space="preserve">20,000</w:t>
-            </w:r>
-          </w:p>
-        </w:tc>
-      </w:tr>
-      <w:tr>
-        <w:tc>
-          <w:tcPr>
-            <w:tcW w:type="dxa" w:w="6960"/>
-            <w:tcBorders>
-              <w:top w:val="single" w:color="A6A6A6" w:sz="4"/>
-              <w:left w:val="single" w:color="A6A6A6" w:sz="4"/>
-              <w:bottom w:val="single" w:color="A6A6A6" w:sz="4"/>
-              <w:right w:val="single" w:color="A6A6A6" w:sz="4"/>
-            </w:tcBorders>
-            <w:tcMar>
-              <w:top w:type="dxa" w:w="30"/>
-              <w:left w:type="dxa" w:w="100"/>
-              <w:bottom w:type="dxa" w:w="30"/>
-              <w:right w:type="dxa" w:w="100"/>
-            </w:tcMar>
-            <w:vAlign w:val="center"/>
-          </w:tcPr>
-          <w:p>
-            <w:pPr>
-              <w:keepNext/>
-              <w:spacing w:after="0" w:before="0" w:line="240"/>
-            </w:pPr>
-            <w:r>
-              <w:rPr>
-                <w:b/>
-                <w:bCs/>
-              </w:rPr>
-              <w:t xml:space="preserve">Subtotal</w:t>
-            </w:r>
-          </w:p>
-        </w:tc>
-        <w:tc>
-          <w:tcPr>
-            <w:tcW w:type="dxa" w:w="2400"/>
-            <w:tcBorders>
-              <w:top w:val="single" w:color="A6A6A6" w:sz="4"/>
-              <w:left w:val="single" w:color="A6A6A6" w:sz="4"/>
-              <w:bottom w:val="single" w:color="A6A6A6" w:sz="4"/>
-              <w:right w:val="single" w:color="A6A6A6" w:sz="4"/>
-            </w:tcBorders>
-            <w:tcMar>
-              <w:top w:type="dxa" w:w="30"/>
-              <w:left w:type="dxa" w:w="100"/>
-              <w:bottom w:type="dxa" w:w="30"/>
-              <w:right w:type="dxa" w:w="100"/>
-            </w:tcMar>
-            <w:vAlign w:val="center"/>
-          </w:tcPr>
-          <w:p>
-            <w:pPr>
-              <w:keepNext/>
-              <w:spacing w:after="0" w:before="0" w:line="240"/>
-              <w:jc w:val="right"/>
-            </w:pPr>
-            <w:r>
-              <w:rPr>
-                <w:b/>
-                <w:bCs/>
-              </w:rPr>
-              <w:t xml:space="preserve">80,000</w:t>
-            </w:r>
-          </w:p>
-        </w:tc>
-      </w:tr>
-      <w:tr>
-        <w:tc>
-          <w:tcPr>
-            <w:tcW w:type="dxa" w:w="6960"/>
-            <w:tcBorders>
-              <w:top w:val="single" w:color="A6A6A6" w:sz="4"/>
-              <w:left w:val="single" w:color="A6A6A6" w:sz="4"/>
-              <w:bottom w:val="single" w:color="A6A6A6" w:sz="4"/>
-              <w:right w:val="single" w:color="A6A6A6" w:sz="4"/>
-            </w:tcBorders>
-            <w:tcMar>
-              <w:top w:type="dxa" w:w="30"/>
-              <w:left w:type="dxa" w:w="100"/>
-              <w:bottom w:type="dxa" w:w="30"/>
-              <w:right w:type="dxa" w:w="100"/>
-            </w:tcMar>
-            <w:vAlign w:val="center"/>
-          </w:tcPr>
-          <w:p>
-            <w:pPr>
-              <w:keepNext/>
-              <w:spacing w:after="0" w:before="0" w:line="240"/>
-            </w:pPr>
-            <w:r>
-              <w:t xml:space="preserve">IVA (16 %)</w:t>
-            </w:r>
-          </w:p>
-        </w:tc>
-        <w:tc>
-          <w:tcPr>
-            <w:tcW w:type="dxa" w:w="2400"/>
-            <w:tcBorders>
-              <w:top w:val="single" w:color="A6A6A6" w:sz="4"/>
-              <w:left w:val="single" w:color="A6A6A6" w:sz="4"/>
-              <w:bottom w:val="single" w:color="A6A6A6" w:sz="4"/>
-              <w:right w:val="single" w:color="A6A6A6" w:sz="4"/>
-            </w:tcBorders>
-            <w:tcMar>
-              <w:top w:type="dxa" w:w="30"/>
-              <w:left w:type="dxa" w:w="100"/>
-              <w:bottom w:type="dxa" w:w="30"/>
-              <w:right w:type="dxa" w:w="100"/>
-            </w:tcMar>
-            <w:vAlign w:val="center"/>
-          </w:tcPr>
-          <w:p>
-            <w:pPr>
-              <w:keepNext/>
-              <w:spacing w:after="0" w:before="0" w:line="240"/>
-              <w:jc w:val="right"/>
-            </w:pPr>
-            <w:r>
-              <w:t xml:space="preserve">12,800</w:t>
-            </w:r>
-          </w:p>
-        </w:tc>
-      </w:tr>
-      <w:tr>
-        <w:tc>
-          <w:tcPr>
-            <w:tcW w:type="dxa" w:w="6960"/>
-            <w:tcBorders>
-              <w:top w:val="single" w:color="A6A6A6" w:sz="4"/>
-              <w:left w:val="single" w:color="A6A6A6" w:sz="4"/>
-              <w:bottom w:val="single" w:color="A6A6A6" w:sz="4"/>
-              <w:right w:val="single" w:color="A6A6A6" w:sz="4"/>
-            </w:tcBorders>
-            <w:tcMar>
-              <w:top w:type="dxa" w:w="30"/>
-              <w:left w:type="dxa" w:w="100"/>
-              <w:bottom w:type="dxa" w:w="30"/>
-              <w:right w:type="dxa" w:w="100"/>
-            </w:tcMar>
-            <w:vAlign w:val="center"/>
-          </w:tcPr>
-          <w:p>
-            <w:pPr>
-              <w:keepNext w:val="false"/>
-              <w:spacing w:after="0" w:before="0" w:line="240"/>
-            </w:pPr>
-            <w:r>
-              <w:rPr>
-                <w:b/>
-                <w:bCs/>
-              </w:rPr>
-              <w:t xml:space="preserve">Total</w:t>
-            </w:r>
-          </w:p>
-        </w:tc>
-        <w:tc>
-          <w:tcPr>
-            <w:tcW w:type="dxa" w:w="2400"/>
-            <w:tcBorders>
-              <w:top w:val="single" w:color="A6A6A6" w:sz="4"/>
-              <w:left w:val="single" w:color="A6A6A6" w:sz="4"/>
-              <w:bottom w:val="single" w:color="A6A6A6" w:sz="4"/>
-              <w:right w:val="single" w:color="A6A6A6" w:sz="4"/>
-            </w:tcBorders>
-            <w:tcMar>
-              <w:top w:type="dxa" w:w="30"/>
-              <w:left w:type="dxa" w:w="100"/>
-              <w:bottom w:type="dxa" w:w="30"/>
-              <w:right w:type="dxa" w:w="100"/>
-            </w:tcMar>
-            <w:vAlign w:val="center"/>
-          </w:tcPr>
-          <w:p>
-            <w:pPr>
-              <w:keepNext w:val="false"/>
-              <w:spacing w:after="0" w:before="0" w:line="240"/>
-              <w:jc w:val="right"/>
-            </w:pPr>
-            <w:r>
-              <w:rPr>
-                <w:b/>
-                <w:bCs/>
-              </w:rPr>
-              <w:t xml:space="preserve">92,800</w:t>
-            </w:r>
-          </w:p>
-        </w:tc>
-      </w:tr>
-    </w:tbl>
     <w:p>
-      <w:pPr>
-        <w:spacing w:after="0"/>
-      </w:pPr>
+      <w:r>
+        <w:t xml:space="preserve">El Observatorio Nacional para la Igualdad de Género en las Instituciones de Educación Superior (ONIGIES) renueva su plataforma para registrar, validar y dar a conocer los resultados de las instituciones de educación superior (IES) conforme a la nueva metodología. El servicio comprende los módulos y actividades siguientes, calendarizados en el cronograma anexo:</w:t>
+      </w:r>
     </w:p>
     <w:p>
       <w:pPr>
@@ -1238,7 +381,7 @@
     </w:p>
     <w:p>
       <w:r>
-        <w:t xml:space="preserve">Semanas de trabajo; la entrega final está prevista para la segunda semana de diciembre.</w:t>
+        <w:t xml:space="preserve">Módulos y actividades en el orden del cuadro de conceptos entregado a la Titular; semanas de trabajo sombreadas. La entrega final está prevista para la segunda semana de diciembre.</w:t>
       </w:r>
     </w:p>
     <w:tbl>
@@ -1804,6 +947,303 @@
               <w:bottom w:val="single" w:color="A6A6A6" w:sz="4"/>
               <w:right w:val="single" w:color="A6A6A6" w:sz="4"/>
             </w:tcBorders>
+            <w:shd w:fill="F2F2F2" w:color="auto" w:val="clear"/>
+            <w:tcMar>
+              <w:top w:type="dxa" w:w="30"/>
+              <w:left w:type="dxa" w:w="100"/>
+              <w:bottom w:type="dxa" w:w="30"/>
+              <w:right w:type="dxa" w:w="100"/>
+            </w:tcMar>
+            <w:vAlign w:val="center"/>
+          </w:tcPr>
+          <w:p>
+            <w:pPr>
+              <w:spacing w:after="0" w:before="0" w:line="240"/>
+            </w:pPr>
+            <w:r>
+              <w:rPr>
+                <w:b/>
+                <w:bCs/>
+              </w:rPr>
+              <w:t xml:space="preserve">Plataforma pública</w:t>
+            </w:r>
+          </w:p>
+        </w:tc>
+        <w:tc>
+          <w:tcPr>
+            <w:tcW w:type="dxa" w:w="785"/>
+            <w:tcBorders>
+              <w:top w:val="single" w:color="A6A6A6" w:sz="4"/>
+              <w:left w:val="single" w:color="A6A6A6" w:sz="4"/>
+              <w:bottom w:val="single" w:color="A6A6A6" w:sz="4"/>
+              <w:right w:val="single" w:color="A6A6A6" w:sz="4"/>
+            </w:tcBorders>
+            <w:shd w:fill="F2F2F2" w:color="auto" w:val="clear"/>
+            <w:tcMar>
+              <w:top w:type="dxa" w:w="30"/>
+              <w:left w:type="dxa" w:w="100"/>
+              <w:bottom w:type="dxa" w:w="30"/>
+              <w:right w:type="dxa" w:w="100"/>
+            </w:tcMar>
+            <w:vAlign w:val="center"/>
+          </w:tcPr>
+          <w:p>
+            <w:pPr>
+              <w:spacing w:after="0" w:before="0" w:line="240"/>
+            </w:pPr>
+          </w:p>
+        </w:tc>
+        <w:tc>
+          <w:tcPr>
+            <w:tcW w:type="dxa" w:w="785"/>
+            <w:tcBorders>
+              <w:top w:val="single" w:color="A6A6A6" w:sz="4"/>
+              <w:left w:val="single" w:color="A6A6A6" w:sz="4"/>
+              <w:bottom w:val="single" w:color="A6A6A6" w:sz="4"/>
+              <w:right w:val="single" w:color="A6A6A6" w:sz="4"/>
+            </w:tcBorders>
+            <w:shd w:fill="F2F2F2" w:color="auto" w:val="clear"/>
+            <w:tcMar>
+              <w:top w:type="dxa" w:w="30"/>
+              <w:left w:type="dxa" w:w="100"/>
+              <w:bottom w:type="dxa" w:w="30"/>
+              <w:right w:type="dxa" w:w="100"/>
+            </w:tcMar>
+            <w:vAlign w:val="center"/>
+          </w:tcPr>
+          <w:p>
+            <w:pPr>
+              <w:spacing w:after="0" w:before="0" w:line="240"/>
+            </w:pPr>
+          </w:p>
+        </w:tc>
+        <w:tc>
+          <w:tcPr>
+            <w:tcW w:type="dxa" w:w="785"/>
+            <w:tcBorders>
+              <w:top w:val="single" w:color="A6A6A6" w:sz="4"/>
+              <w:left w:val="single" w:color="A6A6A6" w:sz="4"/>
+              <w:bottom w:val="single" w:color="A6A6A6" w:sz="4"/>
+              <w:right w:val="single" w:color="A6A6A6" w:sz="4"/>
+            </w:tcBorders>
+            <w:shd w:fill="F2F2F2" w:color="auto" w:val="clear"/>
+            <w:tcMar>
+              <w:top w:type="dxa" w:w="30"/>
+              <w:left w:type="dxa" w:w="100"/>
+              <w:bottom w:type="dxa" w:w="30"/>
+              <w:right w:type="dxa" w:w="100"/>
+            </w:tcMar>
+            <w:vAlign w:val="center"/>
+          </w:tcPr>
+          <w:p>
+            <w:pPr>
+              <w:spacing w:after="0" w:before="0" w:line="240"/>
+            </w:pPr>
+          </w:p>
+        </w:tc>
+        <w:tc>
+          <w:tcPr>
+            <w:tcW w:type="dxa" w:w="785"/>
+            <w:tcBorders>
+              <w:top w:val="single" w:color="A6A6A6" w:sz="4"/>
+              <w:left w:val="single" w:color="A6A6A6" w:sz="4"/>
+              <w:bottom w:val="single" w:color="A6A6A6" w:sz="4"/>
+              <w:right w:val="single" w:color="A6A6A6" w:sz="4"/>
+            </w:tcBorders>
+            <w:shd w:fill="F2F2F2" w:color="auto" w:val="clear"/>
+            <w:tcMar>
+              <w:top w:type="dxa" w:w="30"/>
+              <w:left w:type="dxa" w:w="100"/>
+              <w:bottom w:type="dxa" w:w="30"/>
+              <w:right w:type="dxa" w:w="100"/>
+            </w:tcMar>
+            <w:vAlign w:val="center"/>
+          </w:tcPr>
+          <w:p>
+            <w:pPr>
+              <w:spacing w:after="0" w:before="0" w:line="240"/>
+            </w:pPr>
+          </w:p>
+        </w:tc>
+        <w:tc>
+          <w:tcPr>
+            <w:tcW w:type="dxa" w:w="785"/>
+            <w:tcBorders>
+              <w:top w:val="single" w:color="A6A6A6" w:sz="4"/>
+              <w:left w:val="single" w:color="A6A6A6" w:sz="4"/>
+              <w:bottom w:val="single" w:color="A6A6A6" w:sz="4"/>
+              <w:right w:val="single" w:color="A6A6A6" w:sz="4"/>
+            </w:tcBorders>
+            <w:shd w:fill="F2F2F2" w:color="auto" w:val="clear"/>
+            <w:tcMar>
+              <w:top w:type="dxa" w:w="30"/>
+              <w:left w:type="dxa" w:w="100"/>
+              <w:bottom w:type="dxa" w:w="30"/>
+              <w:right w:type="dxa" w:w="100"/>
+            </w:tcMar>
+            <w:vAlign w:val="center"/>
+          </w:tcPr>
+          <w:p>
+            <w:pPr>
+              <w:spacing w:after="0" w:before="0" w:line="240"/>
+            </w:pPr>
+          </w:p>
+        </w:tc>
+        <w:tc>
+          <w:tcPr>
+            <w:tcW w:type="dxa" w:w="785"/>
+            <w:tcBorders>
+              <w:top w:val="single" w:color="A6A6A6" w:sz="4"/>
+              <w:left w:val="single" w:color="A6A6A6" w:sz="4"/>
+              <w:bottom w:val="single" w:color="A6A6A6" w:sz="4"/>
+              <w:right w:val="single" w:color="A6A6A6" w:sz="4"/>
+            </w:tcBorders>
+            <w:shd w:fill="F2F2F2" w:color="auto" w:val="clear"/>
+            <w:tcMar>
+              <w:top w:type="dxa" w:w="30"/>
+              <w:left w:type="dxa" w:w="100"/>
+              <w:bottom w:type="dxa" w:w="30"/>
+              <w:right w:type="dxa" w:w="100"/>
+            </w:tcMar>
+            <w:vAlign w:val="center"/>
+          </w:tcPr>
+          <w:p>
+            <w:pPr>
+              <w:spacing w:after="0" w:before="0" w:line="240"/>
+            </w:pPr>
+          </w:p>
+        </w:tc>
+        <w:tc>
+          <w:tcPr>
+            <w:tcW w:type="dxa" w:w="785"/>
+            <w:tcBorders>
+              <w:top w:val="single" w:color="A6A6A6" w:sz="4"/>
+              <w:left w:val="single" w:color="A6A6A6" w:sz="4"/>
+              <w:bottom w:val="single" w:color="A6A6A6" w:sz="4"/>
+              <w:right w:val="single" w:color="A6A6A6" w:sz="4"/>
+            </w:tcBorders>
+            <w:shd w:fill="F2F2F2" w:color="auto" w:val="clear"/>
+            <w:tcMar>
+              <w:top w:type="dxa" w:w="30"/>
+              <w:left w:type="dxa" w:w="100"/>
+              <w:bottom w:type="dxa" w:w="30"/>
+              <w:right w:type="dxa" w:w="100"/>
+            </w:tcMar>
+            <w:vAlign w:val="center"/>
+          </w:tcPr>
+          <w:p>
+            <w:pPr>
+              <w:spacing w:after="0" w:before="0" w:line="240"/>
+            </w:pPr>
+          </w:p>
+        </w:tc>
+        <w:tc>
+          <w:tcPr>
+            <w:tcW w:type="dxa" w:w="785"/>
+            <w:tcBorders>
+              <w:top w:val="single" w:color="A6A6A6" w:sz="4"/>
+              <w:left w:val="single" w:color="A6A6A6" w:sz="4"/>
+              <w:bottom w:val="single" w:color="A6A6A6" w:sz="4"/>
+              <w:right w:val="single" w:color="A6A6A6" w:sz="4"/>
+            </w:tcBorders>
+            <w:shd w:fill="F2F2F2" w:color="auto" w:val="clear"/>
+            <w:tcMar>
+              <w:top w:type="dxa" w:w="30"/>
+              <w:left w:type="dxa" w:w="100"/>
+              <w:bottom w:type="dxa" w:w="30"/>
+              <w:right w:type="dxa" w:w="100"/>
+            </w:tcMar>
+            <w:vAlign w:val="center"/>
+          </w:tcPr>
+          <w:p>
+            <w:pPr>
+              <w:spacing w:after="0" w:before="0" w:line="240"/>
+            </w:pPr>
+          </w:p>
+        </w:tc>
+        <w:tc>
+          <w:tcPr>
+            <w:tcW w:type="dxa" w:w="785"/>
+            <w:tcBorders>
+              <w:top w:val="single" w:color="A6A6A6" w:sz="4"/>
+              <w:left w:val="single" w:color="A6A6A6" w:sz="4"/>
+              <w:bottom w:val="single" w:color="A6A6A6" w:sz="4"/>
+              <w:right w:val="single" w:color="A6A6A6" w:sz="4"/>
+            </w:tcBorders>
+            <w:shd w:fill="F2F2F2" w:color="auto" w:val="clear"/>
+            <w:tcMar>
+              <w:top w:type="dxa" w:w="30"/>
+              <w:left w:type="dxa" w:w="100"/>
+              <w:bottom w:type="dxa" w:w="30"/>
+              <w:right w:type="dxa" w:w="100"/>
+            </w:tcMar>
+            <w:vAlign w:val="center"/>
+          </w:tcPr>
+          <w:p>
+            <w:pPr>
+              <w:spacing w:after="0" w:before="0" w:line="240"/>
+            </w:pPr>
+          </w:p>
+        </w:tc>
+        <w:tc>
+          <w:tcPr>
+            <w:tcW w:type="dxa" w:w="785"/>
+            <w:tcBorders>
+              <w:top w:val="single" w:color="A6A6A6" w:sz="4"/>
+              <w:left w:val="single" w:color="A6A6A6" w:sz="4"/>
+              <w:bottom w:val="single" w:color="A6A6A6" w:sz="4"/>
+              <w:right w:val="single" w:color="A6A6A6" w:sz="4"/>
+            </w:tcBorders>
+            <w:shd w:fill="F2F2F2" w:color="auto" w:val="clear"/>
+            <w:tcMar>
+              <w:top w:type="dxa" w:w="30"/>
+              <w:left w:type="dxa" w:w="100"/>
+              <w:bottom w:type="dxa" w:w="30"/>
+              <w:right w:type="dxa" w:w="100"/>
+            </w:tcMar>
+            <w:vAlign w:val="center"/>
+          </w:tcPr>
+          <w:p>
+            <w:pPr>
+              <w:spacing w:after="0" w:before="0" w:line="240"/>
+            </w:pPr>
+          </w:p>
+        </w:tc>
+        <w:tc>
+          <w:tcPr>
+            <w:tcW w:type="dxa" w:w="785"/>
+            <w:tcBorders>
+              <w:top w:val="single" w:color="A6A6A6" w:sz="4"/>
+              <w:left w:val="single" w:color="A6A6A6" w:sz="4"/>
+              <w:bottom w:val="single" w:color="A6A6A6" w:sz="4"/>
+              <w:right w:val="single" w:color="A6A6A6" w:sz="4"/>
+            </w:tcBorders>
+            <w:shd w:fill="F2F2F2" w:color="auto" w:val="clear"/>
+            <w:tcMar>
+              <w:top w:type="dxa" w:w="30"/>
+              <w:left w:type="dxa" w:w="100"/>
+              <w:bottom w:type="dxa" w:w="30"/>
+              <w:right w:type="dxa" w:w="100"/>
+            </w:tcMar>
+            <w:vAlign w:val="center"/>
+          </w:tcPr>
+          <w:p>
+            <w:pPr>
+              <w:spacing w:after="0" w:before="0" w:line="240"/>
+            </w:pPr>
+          </w:p>
+        </w:tc>
+      </w:tr>
+      <w:tr>
+        <w:tc>
+          <w:tcPr>
+            <w:tcW w:type="dxa" w:w="4325"/>
+            <w:tcBorders>
+              <w:top w:val="single" w:color="A6A6A6" w:sz="4"/>
+              <w:left w:val="single" w:color="A6A6A6" w:sz="4"/>
+              <w:bottom w:val="single" w:color="A6A6A6" w:sz="4"/>
+              <w:right w:val="single" w:color="A6A6A6" w:sz="4"/>
+            </w:tcBorders>
             <w:tcMar>
               <w:top w:type="dxa" w:w="30"/>
               <w:left w:type="dxa" w:w="100"/>
@@ -2941,6 +2381,303 @@
               <w:bottom w:val="single" w:color="A6A6A6" w:sz="4"/>
               <w:right w:val="single" w:color="A6A6A6" w:sz="4"/>
             </w:tcBorders>
+            <w:shd w:fill="F2F2F2" w:color="auto" w:val="clear"/>
+            <w:tcMar>
+              <w:top w:type="dxa" w:w="30"/>
+              <w:left w:type="dxa" w:w="100"/>
+              <w:bottom w:type="dxa" w:w="30"/>
+              <w:right w:type="dxa" w:w="100"/>
+            </w:tcMar>
+            <w:vAlign w:val="center"/>
+          </w:tcPr>
+          <w:p>
+            <w:pPr>
+              <w:spacing w:after="0" w:before="0" w:line="240"/>
+            </w:pPr>
+            <w:r>
+              <w:rPr>
+                <w:b/>
+                <w:bCs/>
+              </w:rPr>
+              <w:t xml:space="preserve">Base de datos</w:t>
+            </w:r>
+          </w:p>
+        </w:tc>
+        <w:tc>
+          <w:tcPr>
+            <w:tcW w:type="dxa" w:w="785"/>
+            <w:tcBorders>
+              <w:top w:val="single" w:color="A6A6A6" w:sz="4"/>
+              <w:left w:val="single" w:color="A6A6A6" w:sz="4"/>
+              <w:bottom w:val="single" w:color="A6A6A6" w:sz="4"/>
+              <w:right w:val="single" w:color="A6A6A6" w:sz="4"/>
+            </w:tcBorders>
+            <w:shd w:fill="F2F2F2" w:color="auto" w:val="clear"/>
+            <w:tcMar>
+              <w:top w:type="dxa" w:w="30"/>
+              <w:left w:type="dxa" w:w="100"/>
+              <w:bottom w:type="dxa" w:w="30"/>
+              <w:right w:type="dxa" w:w="100"/>
+            </w:tcMar>
+            <w:vAlign w:val="center"/>
+          </w:tcPr>
+          <w:p>
+            <w:pPr>
+              <w:spacing w:after="0" w:before="0" w:line="240"/>
+            </w:pPr>
+          </w:p>
+        </w:tc>
+        <w:tc>
+          <w:tcPr>
+            <w:tcW w:type="dxa" w:w="785"/>
+            <w:tcBorders>
+              <w:top w:val="single" w:color="A6A6A6" w:sz="4"/>
+              <w:left w:val="single" w:color="A6A6A6" w:sz="4"/>
+              <w:bottom w:val="single" w:color="A6A6A6" w:sz="4"/>
+              <w:right w:val="single" w:color="A6A6A6" w:sz="4"/>
+            </w:tcBorders>
+            <w:shd w:fill="F2F2F2" w:color="auto" w:val="clear"/>
+            <w:tcMar>
+              <w:top w:type="dxa" w:w="30"/>
+              <w:left w:type="dxa" w:w="100"/>
+              <w:bottom w:type="dxa" w:w="30"/>
+              <w:right w:type="dxa" w:w="100"/>
+            </w:tcMar>
+            <w:vAlign w:val="center"/>
+          </w:tcPr>
+          <w:p>
+            <w:pPr>
+              <w:spacing w:after="0" w:before="0" w:line="240"/>
+            </w:pPr>
+          </w:p>
+        </w:tc>
+        <w:tc>
+          <w:tcPr>
+            <w:tcW w:type="dxa" w:w="785"/>
+            <w:tcBorders>
+              <w:top w:val="single" w:color="A6A6A6" w:sz="4"/>
+              <w:left w:val="single" w:color="A6A6A6" w:sz="4"/>
+              <w:bottom w:val="single" w:color="A6A6A6" w:sz="4"/>
+              <w:right w:val="single" w:color="A6A6A6" w:sz="4"/>
+            </w:tcBorders>
+            <w:shd w:fill="F2F2F2" w:color="auto" w:val="clear"/>
+            <w:tcMar>
+              <w:top w:type="dxa" w:w="30"/>
+              <w:left w:type="dxa" w:w="100"/>
+              <w:bottom w:type="dxa" w:w="30"/>
+              <w:right w:type="dxa" w:w="100"/>
+            </w:tcMar>
+            <w:vAlign w:val="center"/>
+          </w:tcPr>
+          <w:p>
+            <w:pPr>
+              <w:spacing w:after="0" w:before="0" w:line="240"/>
+            </w:pPr>
+          </w:p>
+        </w:tc>
+        <w:tc>
+          <w:tcPr>
+            <w:tcW w:type="dxa" w:w="785"/>
+            <w:tcBorders>
+              <w:top w:val="single" w:color="A6A6A6" w:sz="4"/>
+              <w:left w:val="single" w:color="A6A6A6" w:sz="4"/>
+              <w:bottom w:val="single" w:color="A6A6A6" w:sz="4"/>
+              <w:right w:val="single" w:color="A6A6A6" w:sz="4"/>
+            </w:tcBorders>
+            <w:shd w:fill="F2F2F2" w:color="auto" w:val="clear"/>
+            <w:tcMar>
+              <w:top w:type="dxa" w:w="30"/>
+              <w:left w:type="dxa" w:w="100"/>
+              <w:bottom w:type="dxa" w:w="30"/>
+              <w:right w:type="dxa" w:w="100"/>
+            </w:tcMar>
+            <w:vAlign w:val="center"/>
+          </w:tcPr>
+          <w:p>
+            <w:pPr>
+              <w:spacing w:after="0" w:before="0" w:line="240"/>
+            </w:pPr>
+          </w:p>
+        </w:tc>
+        <w:tc>
+          <w:tcPr>
+            <w:tcW w:type="dxa" w:w="785"/>
+            <w:tcBorders>
+              <w:top w:val="single" w:color="A6A6A6" w:sz="4"/>
+              <w:left w:val="single" w:color="A6A6A6" w:sz="4"/>
+              <w:bottom w:val="single" w:color="A6A6A6" w:sz="4"/>
+              <w:right w:val="single" w:color="A6A6A6" w:sz="4"/>
+            </w:tcBorders>
+            <w:shd w:fill="F2F2F2" w:color="auto" w:val="clear"/>
+            <w:tcMar>
+              <w:top w:type="dxa" w:w="30"/>
+              <w:left w:type="dxa" w:w="100"/>
+              <w:bottom w:type="dxa" w:w="30"/>
+              <w:right w:type="dxa" w:w="100"/>
+            </w:tcMar>
+            <w:vAlign w:val="center"/>
+          </w:tcPr>
+          <w:p>
+            <w:pPr>
+              <w:spacing w:after="0" w:before="0" w:line="240"/>
+            </w:pPr>
+          </w:p>
+        </w:tc>
+        <w:tc>
+          <w:tcPr>
+            <w:tcW w:type="dxa" w:w="785"/>
+            <w:tcBorders>
+              <w:top w:val="single" w:color="A6A6A6" w:sz="4"/>
+              <w:left w:val="single" w:color="A6A6A6" w:sz="4"/>
+              <w:bottom w:val="single" w:color="A6A6A6" w:sz="4"/>
+              <w:right w:val="single" w:color="A6A6A6" w:sz="4"/>
+            </w:tcBorders>
+            <w:shd w:fill="F2F2F2" w:color="auto" w:val="clear"/>
+            <w:tcMar>
+              <w:top w:type="dxa" w:w="30"/>
+              <w:left w:type="dxa" w:w="100"/>
+              <w:bottom w:type="dxa" w:w="30"/>
+              <w:right w:type="dxa" w:w="100"/>
+            </w:tcMar>
+            <w:vAlign w:val="center"/>
+          </w:tcPr>
+          <w:p>
+            <w:pPr>
+              <w:spacing w:after="0" w:before="0" w:line="240"/>
+            </w:pPr>
+          </w:p>
+        </w:tc>
+        <w:tc>
+          <w:tcPr>
+            <w:tcW w:type="dxa" w:w="785"/>
+            <w:tcBorders>
+              <w:top w:val="single" w:color="A6A6A6" w:sz="4"/>
+              <w:left w:val="single" w:color="A6A6A6" w:sz="4"/>
+              <w:bottom w:val="single" w:color="A6A6A6" w:sz="4"/>
+              <w:right w:val="single" w:color="A6A6A6" w:sz="4"/>
+            </w:tcBorders>
+            <w:shd w:fill="F2F2F2" w:color="auto" w:val="clear"/>
+            <w:tcMar>
+              <w:top w:type="dxa" w:w="30"/>
+              <w:left w:type="dxa" w:w="100"/>
+              <w:bottom w:type="dxa" w:w="30"/>
+              <w:right w:type="dxa" w:w="100"/>
+            </w:tcMar>
+            <w:vAlign w:val="center"/>
+          </w:tcPr>
+          <w:p>
+            <w:pPr>
+              <w:spacing w:after="0" w:before="0" w:line="240"/>
+            </w:pPr>
+          </w:p>
+        </w:tc>
+        <w:tc>
+          <w:tcPr>
+            <w:tcW w:type="dxa" w:w="785"/>
+            <w:tcBorders>
+              <w:top w:val="single" w:color="A6A6A6" w:sz="4"/>
+              <w:left w:val="single" w:color="A6A6A6" w:sz="4"/>
+              <w:bottom w:val="single" w:color="A6A6A6" w:sz="4"/>
+              <w:right w:val="single" w:color="A6A6A6" w:sz="4"/>
+            </w:tcBorders>
+            <w:shd w:fill="F2F2F2" w:color="auto" w:val="clear"/>
+            <w:tcMar>
+              <w:top w:type="dxa" w:w="30"/>
+              <w:left w:type="dxa" w:w="100"/>
+              <w:bottom w:type="dxa" w:w="30"/>
+              <w:right w:type="dxa" w:w="100"/>
+            </w:tcMar>
+            <w:vAlign w:val="center"/>
+          </w:tcPr>
+          <w:p>
+            <w:pPr>
+              <w:spacing w:after="0" w:before="0" w:line="240"/>
+            </w:pPr>
+          </w:p>
+        </w:tc>
+        <w:tc>
+          <w:tcPr>
+            <w:tcW w:type="dxa" w:w="785"/>
+            <w:tcBorders>
+              <w:top w:val="single" w:color="A6A6A6" w:sz="4"/>
+              <w:left w:val="single" w:color="A6A6A6" w:sz="4"/>
+              <w:bottom w:val="single" w:color="A6A6A6" w:sz="4"/>
+              <w:right w:val="single" w:color="A6A6A6" w:sz="4"/>
+            </w:tcBorders>
+            <w:shd w:fill="F2F2F2" w:color="auto" w:val="clear"/>
+            <w:tcMar>
+              <w:top w:type="dxa" w:w="30"/>
+              <w:left w:type="dxa" w:w="100"/>
+              <w:bottom w:type="dxa" w:w="30"/>
+              <w:right w:type="dxa" w:w="100"/>
+            </w:tcMar>
+            <w:vAlign w:val="center"/>
+          </w:tcPr>
+          <w:p>
+            <w:pPr>
+              <w:spacing w:after="0" w:before="0" w:line="240"/>
+            </w:pPr>
+          </w:p>
+        </w:tc>
+        <w:tc>
+          <w:tcPr>
+            <w:tcW w:type="dxa" w:w="785"/>
+            <w:tcBorders>
+              <w:top w:val="single" w:color="A6A6A6" w:sz="4"/>
+              <w:left w:val="single" w:color="A6A6A6" w:sz="4"/>
+              <w:bottom w:val="single" w:color="A6A6A6" w:sz="4"/>
+              <w:right w:val="single" w:color="A6A6A6" w:sz="4"/>
+            </w:tcBorders>
+            <w:shd w:fill="F2F2F2" w:color="auto" w:val="clear"/>
+            <w:tcMar>
+              <w:top w:type="dxa" w:w="30"/>
+              <w:left w:type="dxa" w:w="100"/>
+              <w:bottom w:type="dxa" w:w="30"/>
+              <w:right w:type="dxa" w:w="100"/>
+            </w:tcMar>
+            <w:vAlign w:val="center"/>
+          </w:tcPr>
+          <w:p>
+            <w:pPr>
+              <w:spacing w:after="0" w:before="0" w:line="240"/>
+            </w:pPr>
+          </w:p>
+        </w:tc>
+        <w:tc>
+          <w:tcPr>
+            <w:tcW w:type="dxa" w:w="785"/>
+            <w:tcBorders>
+              <w:top w:val="single" w:color="A6A6A6" w:sz="4"/>
+              <w:left w:val="single" w:color="A6A6A6" w:sz="4"/>
+              <w:bottom w:val="single" w:color="A6A6A6" w:sz="4"/>
+              <w:right w:val="single" w:color="A6A6A6" w:sz="4"/>
+            </w:tcBorders>
+            <w:shd w:fill="F2F2F2" w:color="auto" w:val="clear"/>
+            <w:tcMar>
+              <w:top w:type="dxa" w:w="30"/>
+              <w:left w:type="dxa" w:w="100"/>
+              <w:bottom w:type="dxa" w:w="30"/>
+              <w:right w:type="dxa" w:w="100"/>
+            </w:tcMar>
+            <w:vAlign w:val="center"/>
+          </w:tcPr>
+          <w:p>
+            <w:pPr>
+              <w:spacing w:after="0" w:before="0" w:line="240"/>
+            </w:pPr>
+          </w:p>
+        </w:tc>
+      </w:tr>
+      <w:tr>
+        <w:tc>
+          <w:tcPr>
+            <w:tcW w:type="dxa" w:w="4325"/>
+            <w:tcBorders>
+              <w:top w:val="single" w:color="A6A6A6" w:sz="4"/>
+              <w:left w:val="single" w:color="A6A6A6" w:sz="4"/>
+              <w:bottom w:val="single" w:color="A6A6A6" w:sz="4"/>
+              <w:right w:val="single" w:color="A6A6A6" w:sz="4"/>
+            </w:tcBorders>
             <w:tcMar>
               <w:top w:type="dxa" w:w="30"/>
               <w:left w:type="dxa" w:w="100"/>
@@ -3483,6 +3220,303 @@
               <w:bottom w:val="single" w:color="A6A6A6" w:sz="4"/>
               <w:right w:val="single" w:color="A6A6A6" w:sz="4"/>
             </w:tcBorders>
+            <w:tcMar>
+              <w:top w:type="dxa" w:w="30"/>
+              <w:left w:type="dxa" w:w="100"/>
+              <w:bottom w:type="dxa" w:w="30"/>
+              <w:right w:type="dxa" w:w="100"/>
+            </w:tcMar>
+            <w:vAlign w:val="center"/>
+          </w:tcPr>
+          <w:p>
+            <w:pPr>
+              <w:spacing w:after="0" w:before="0" w:line="240"/>
+            </w:pPr>
+          </w:p>
+        </w:tc>
+      </w:tr>
+      <w:tr>
+        <w:tc>
+          <w:tcPr>
+            <w:tcW w:type="dxa" w:w="4325"/>
+            <w:tcBorders>
+              <w:top w:val="single" w:color="A6A6A6" w:sz="4"/>
+              <w:left w:val="single" w:color="A6A6A6" w:sz="4"/>
+              <w:bottom w:val="single" w:color="A6A6A6" w:sz="4"/>
+              <w:right w:val="single" w:color="A6A6A6" w:sz="4"/>
+            </w:tcBorders>
+            <w:shd w:fill="F2F2F2" w:color="auto" w:val="clear"/>
+            <w:tcMar>
+              <w:top w:type="dxa" w:w="30"/>
+              <w:left w:type="dxa" w:w="100"/>
+              <w:bottom w:type="dxa" w:w="30"/>
+              <w:right w:type="dxa" w:w="100"/>
+            </w:tcMar>
+            <w:vAlign w:val="center"/>
+          </w:tcPr>
+          <w:p>
+            <w:pPr>
+              <w:spacing w:after="0" w:before="0" w:line="240"/>
+            </w:pPr>
+            <w:r>
+              <w:rPr>
+                <w:b/>
+                <w:bCs/>
+              </w:rPr>
+              <w:t xml:space="preserve">Diseño de visualizaciones de población</w:t>
+            </w:r>
+          </w:p>
+        </w:tc>
+        <w:tc>
+          <w:tcPr>
+            <w:tcW w:type="dxa" w:w="785"/>
+            <w:tcBorders>
+              <w:top w:val="single" w:color="A6A6A6" w:sz="4"/>
+              <w:left w:val="single" w:color="A6A6A6" w:sz="4"/>
+              <w:bottom w:val="single" w:color="A6A6A6" w:sz="4"/>
+              <w:right w:val="single" w:color="A6A6A6" w:sz="4"/>
+            </w:tcBorders>
+            <w:shd w:fill="F2F2F2" w:color="auto" w:val="clear"/>
+            <w:tcMar>
+              <w:top w:type="dxa" w:w="30"/>
+              <w:left w:type="dxa" w:w="100"/>
+              <w:bottom w:type="dxa" w:w="30"/>
+              <w:right w:type="dxa" w:w="100"/>
+            </w:tcMar>
+            <w:vAlign w:val="center"/>
+          </w:tcPr>
+          <w:p>
+            <w:pPr>
+              <w:spacing w:after="0" w:before="0" w:line="240"/>
+            </w:pPr>
+          </w:p>
+        </w:tc>
+        <w:tc>
+          <w:tcPr>
+            <w:tcW w:type="dxa" w:w="785"/>
+            <w:tcBorders>
+              <w:top w:val="single" w:color="A6A6A6" w:sz="4"/>
+              <w:left w:val="single" w:color="A6A6A6" w:sz="4"/>
+              <w:bottom w:val="single" w:color="A6A6A6" w:sz="4"/>
+              <w:right w:val="single" w:color="A6A6A6" w:sz="4"/>
+            </w:tcBorders>
+            <w:shd w:fill="F2F2F2" w:color="auto" w:val="clear"/>
+            <w:tcMar>
+              <w:top w:type="dxa" w:w="30"/>
+              <w:left w:type="dxa" w:w="100"/>
+              <w:bottom w:type="dxa" w:w="30"/>
+              <w:right w:type="dxa" w:w="100"/>
+            </w:tcMar>
+            <w:vAlign w:val="center"/>
+          </w:tcPr>
+          <w:p>
+            <w:pPr>
+              <w:spacing w:after="0" w:before="0" w:line="240"/>
+            </w:pPr>
+          </w:p>
+        </w:tc>
+        <w:tc>
+          <w:tcPr>
+            <w:tcW w:type="dxa" w:w="785"/>
+            <w:tcBorders>
+              <w:top w:val="single" w:color="A6A6A6" w:sz="4"/>
+              <w:left w:val="single" w:color="A6A6A6" w:sz="4"/>
+              <w:bottom w:val="single" w:color="A6A6A6" w:sz="4"/>
+              <w:right w:val="single" w:color="A6A6A6" w:sz="4"/>
+            </w:tcBorders>
+            <w:shd w:fill="F2F2F2" w:color="auto" w:val="clear"/>
+            <w:tcMar>
+              <w:top w:type="dxa" w:w="30"/>
+              <w:left w:type="dxa" w:w="100"/>
+              <w:bottom w:type="dxa" w:w="30"/>
+              <w:right w:type="dxa" w:w="100"/>
+            </w:tcMar>
+            <w:vAlign w:val="center"/>
+          </w:tcPr>
+          <w:p>
+            <w:pPr>
+              <w:spacing w:after="0" w:before="0" w:line="240"/>
+            </w:pPr>
+          </w:p>
+        </w:tc>
+        <w:tc>
+          <w:tcPr>
+            <w:tcW w:type="dxa" w:w="785"/>
+            <w:tcBorders>
+              <w:top w:val="single" w:color="A6A6A6" w:sz="4"/>
+              <w:left w:val="single" w:color="A6A6A6" w:sz="4"/>
+              <w:bottom w:val="single" w:color="A6A6A6" w:sz="4"/>
+              <w:right w:val="single" w:color="A6A6A6" w:sz="4"/>
+            </w:tcBorders>
+            <w:shd w:fill="F2F2F2" w:color="auto" w:val="clear"/>
+            <w:tcMar>
+              <w:top w:type="dxa" w:w="30"/>
+              <w:left w:type="dxa" w:w="100"/>
+              <w:bottom w:type="dxa" w:w="30"/>
+              <w:right w:type="dxa" w:w="100"/>
+            </w:tcMar>
+            <w:vAlign w:val="center"/>
+          </w:tcPr>
+          <w:p>
+            <w:pPr>
+              <w:spacing w:after="0" w:before="0" w:line="240"/>
+            </w:pPr>
+          </w:p>
+        </w:tc>
+        <w:tc>
+          <w:tcPr>
+            <w:tcW w:type="dxa" w:w="785"/>
+            <w:tcBorders>
+              <w:top w:val="single" w:color="A6A6A6" w:sz="4"/>
+              <w:left w:val="single" w:color="A6A6A6" w:sz="4"/>
+              <w:bottom w:val="single" w:color="A6A6A6" w:sz="4"/>
+              <w:right w:val="single" w:color="A6A6A6" w:sz="4"/>
+            </w:tcBorders>
+            <w:shd w:fill="F2F2F2" w:color="auto" w:val="clear"/>
+            <w:tcMar>
+              <w:top w:type="dxa" w:w="30"/>
+              <w:left w:type="dxa" w:w="100"/>
+              <w:bottom w:type="dxa" w:w="30"/>
+              <w:right w:type="dxa" w:w="100"/>
+            </w:tcMar>
+            <w:vAlign w:val="center"/>
+          </w:tcPr>
+          <w:p>
+            <w:pPr>
+              <w:spacing w:after="0" w:before="0" w:line="240"/>
+            </w:pPr>
+          </w:p>
+        </w:tc>
+        <w:tc>
+          <w:tcPr>
+            <w:tcW w:type="dxa" w:w="785"/>
+            <w:tcBorders>
+              <w:top w:val="single" w:color="A6A6A6" w:sz="4"/>
+              <w:left w:val="single" w:color="A6A6A6" w:sz="4"/>
+              <w:bottom w:val="single" w:color="A6A6A6" w:sz="4"/>
+              <w:right w:val="single" w:color="A6A6A6" w:sz="4"/>
+            </w:tcBorders>
+            <w:shd w:fill="F2F2F2" w:color="auto" w:val="clear"/>
+            <w:tcMar>
+              <w:top w:type="dxa" w:w="30"/>
+              <w:left w:type="dxa" w:w="100"/>
+              <w:bottom w:type="dxa" w:w="30"/>
+              <w:right w:type="dxa" w:w="100"/>
+            </w:tcMar>
+            <w:vAlign w:val="center"/>
+          </w:tcPr>
+          <w:p>
+            <w:pPr>
+              <w:spacing w:after="0" w:before="0" w:line="240"/>
+            </w:pPr>
+          </w:p>
+        </w:tc>
+        <w:tc>
+          <w:tcPr>
+            <w:tcW w:type="dxa" w:w="785"/>
+            <w:tcBorders>
+              <w:top w:val="single" w:color="A6A6A6" w:sz="4"/>
+              <w:left w:val="single" w:color="A6A6A6" w:sz="4"/>
+              <w:bottom w:val="single" w:color="A6A6A6" w:sz="4"/>
+              <w:right w:val="single" w:color="A6A6A6" w:sz="4"/>
+            </w:tcBorders>
+            <w:shd w:fill="F2F2F2" w:color="auto" w:val="clear"/>
+            <w:tcMar>
+              <w:top w:type="dxa" w:w="30"/>
+              <w:left w:type="dxa" w:w="100"/>
+              <w:bottom w:type="dxa" w:w="30"/>
+              <w:right w:type="dxa" w:w="100"/>
+            </w:tcMar>
+            <w:vAlign w:val="center"/>
+          </w:tcPr>
+          <w:p>
+            <w:pPr>
+              <w:spacing w:after="0" w:before="0" w:line="240"/>
+            </w:pPr>
+          </w:p>
+        </w:tc>
+        <w:tc>
+          <w:tcPr>
+            <w:tcW w:type="dxa" w:w="785"/>
+            <w:tcBorders>
+              <w:top w:val="single" w:color="A6A6A6" w:sz="4"/>
+              <w:left w:val="single" w:color="A6A6A6" w:sz="4"/>
+              <w:bottom w:val="single" w:color="A6A6A6" w:sz="4"/>
+              <w:right w:val="single" w:color="A6A6A6" w:sz="4"/>
+            </w:tcBorders>
+            <w:shd w:fill="F2F2F2" w:color="auto" w:val="clear"/>
+            <w:tcMar>
+              <w:top w:type="dxa" w:w="30"/>
+              <w:left w:type="dxa" w:w="100"/>
+              <w:bottom w:type="dxa" w:w="30"/>
+              <w:right w:type="dxa" w:w="100"/>
+            </w:tcMar>
+            <w:vAlign w:val="center"/>
+          </w:tcPr>
+          <w:p>
+            <w:pPr>
+              <w:spacing w:after="0" w:before="0" w:line="240"/>
+            </w:pPr>
+          </w:p>
+        </w:tc>
+        <w:tc>
+          <w:tcPr>
+            <w:tcW w:type="dxa" w:w="785"/>
+            <w:tcBorders>
+              <w:top w:val="single" w:color="A6A6A6" w:sz="4"/>
+              <w:left w:val="single" w:color="A6A6A6" w:sz="4"/>
+              <w:bottom w:val="single" w:color="A6A6A6" w:sz="4"/>
+              <w:right w:val="single" w:color="A6A6A6" w:sz="4"/>
+            </w:tcBorders>
+            <w:shd w:fill="F2F2F2" w:color="auto" w:val="clear"/>
+            <w:tcMar>
+              <w:top w:type="dxa" w:w="30"/>
+              <w:left w:type="dxa" w:w="100"/>
+              <w:bottom w:type="dxa" w:w="30"/>
+              <w:right w:type="dxa" w:w="100"/>
+            </w:tcMar>
+            <w:vAlign w:val="center"/>
+          </w:tcPr>
+          <w:p>
+            <w:pPr>
+              <w:spacing w:after="0" w:before="0" w:line="240"/>
+            </w:pPr>
+          </w:p>
+        </w:tc>
+        <w:tc>
+          <w:tcPr>
+            <w:tcW w:type="dxa" w:w="785"/>
+            <w:tcBorders>
+              <w:top w:val="single" w:color="A6A6A6" w:sz="4"/>
+              <w:left w:val="single" w:color="A6A6A6" w:sz="4"/>
+              <w:bottom w:val="single" w:color="A6A6A6" w:sz="4"/>
+              <w:right w:val="single" w:color="A6A6A6" w:sz="4"/>
+            </w:tcBorders>
+            <w:shd w:fill="F2F2F2" w:color="auto" w:val="clear"/>
+            <w:tcMar>
+              <w:top w:type="dxa" w:w="30"/>
+              <w:left w:type="dxa" w:w="100"/>
+              <w:bottom w:type="dxa" w:w="30"/>
+              <w:right w:type="dxa" w:w="100"/>
+            </w:tcMar>
+            <w:vAlign w:val="center"/>
+          </w:tcPr>
+          <w:p>
+            <w:pPr>
+              <w:spacing w:after="0" w:before="0" w:line="240"/>
+            </w:pPr>
+          </w:p>
+        </w:tc>
+        <w:tc>
+          <w:tcPr>
+            <w:tcW w:type="dxa" w:w="785"/>
+            <w:tcBorders>
+              <w:top w:val="single" w:color="A6A6A6" w:sz="4"/>
+              <w:left w:val="single" w:color="A6A6A6" w:sz="4"/>
+              <w:bottom w:val="single" w:color="A6A6A6" w:sz="4"/>
+              <w:right w:val="single" w:color="A6A6A6" w:sz="4"/>
+            </w:tcBorders>
+            <w:shd w:fill="F2F2F2" w:color="auto" w:val="clear"/>
             <w:tcMar>
               <w:top w:type="dxa" w:w="30"/>
               <w:left w:type="dxa" w:w="100"/>

</xml_diff>